<commit_message>
03: One-page résumé and consistent contact email
</commit_message>
<xml_diff>
--- a/website/public/resume/Pierce-Seigne-Resume.docx
+++ b/website/public/resume/Pierce-Seigne-Resume.docx
@@ -20,7 +20,34 @@
         <w:jc w:val="center"/>
       </w:pPr>
       <w:r>
-        <w:t>Charlottesville, VA 22903  •  pierceseigne@gmail.com  •  (802) 369-4961  •  pseigne.github.io/website</w:t>
+        <w:t xml:space="preserve">Charlottesville, VA </w:t>
+      </w:r>
+      <w:proofErr w:type="gramStart"/>
+      <w:r>
+        <w:t>22903  •</w:t>
+      </w:r>
+      <w:proofErr w:type="gramEnd"/>
+      <w:r>
+        <w:t xml:space="preserve">  </w:t>
+      </w:r>
+      <w:proofErr w:type="gramStart"/>
+      <w:r>
+        <w:t>pierceseigne@gmail.com  •</w:t>
+      </w:r>
+      <w:proofErr w:type="gramEnd"/>
+      <w:r>
+        <w:t xml:space="preserve">  (802) 369-</w:t>
+      </w:r>
+      <w:proofErr w:type="gramStart"/>
+      <w:r>
+        <w:t>4961  •</w:t>
+      </w:r>
+      <w:proofErr w:type="gramEnd"/>
+      <w:r>
+        <w:t xml:space="preserve">  </w:t>
+      </w:r>
+      <w:r>
+        <w:t>pierceseigne.com</w:t>
       </w:r>
     </w:p>
     <w:p>
@@ -174,7 +201,7 @@
         <w:pStyle w:val="ListBullet"/>
       </w:pPr>
       <w:r>
-        <w:t>Designed the BrainForge Coder Cards concept and prototype, then built the frontend at about.codercards.ai; Neon’s engineering team built the backend.</w:t>
+        <w:t>Designed the BrainForge Coder Cards concept and prototype, then built the frontend at codercards.ai; Neon’s engineering team built the backend.</w:t>
       </w:r>
     </w:p>
     <w:p>
@@ -271,13 +298,7 @@
         <w:rPr>
           <w:b/>
         </w:rPr>
-        <w:t xml:space="preserve">Analysis </w:t>
-      </w:r>
-      <w:r>
-        <w:rPr>
-          <w:b/>
-        </w:rPr>
-        <w:t>of the Impact of Election Contributions on Voter Turnout (Senior Project)</w:t>
+        <w:t>Analysis of the Impact of Election Contributions on Voter Turnout (Senior Project)</w:t>
       </w:r>
       <w:r>
         <w:tab/>
@@ -296,7 +317,7 @@
         <w:pStyle w:val="ListBullet"/>
       </w:pPr>
       <w:r>
-        <w:t>With a team of four, wrote a report on election campaign contributions covering more than 10 million observations, with an executive summary and Python replication files.</w:t>
+        <w:t>With a team of four, wrote a report on election campaign contributions covering about 58 million FEC records, with an executive summary and Python replication files.</w:t>
       </w:r>
     </w:p>
     <w:p>
@@ -349,7 +370,13 @@
         <w:rPr>
           <w:b/>
         </w:rPr>
-        <w:t>TFRRS Indoor NCAA Qualifier Monitor</w:t>
+        <w:t>Syllabus Analyzer</w:t>
+      </w:r>
+      <w:r>
+        <w:rPr>
+          <w:b/>
+        </w:rPr>
+        <w:t xml:space="preserve"> Application</w:t>
       </w:r>
       <w:r>
         <w:tab/>
@@ -360,32 +387,13 @@
         <w:pStyle w:val="ListBullet"/>
       </w:pPr>
       <w:r>
-        <w:t>Built a Python and JavaScript tool that tracks the top-16 NCAA indoor cutoff, with a morning scrape feeding a live view of athletes on the standard.</w:t>
-      </w:r>
-    </w:p>
-    <w:p>
-      <w:pPr>
-        <w:tabs>
-          <w:tab w:val="right" w:pos="10512"/>
-        </w:tabs>
-        <w:spacing w:before="80"/>
-      </w:pPr>
-      <w:r>
-        <w:rPr>
-          <w:b/>
-        </w:rPr>
-        <w:t>Syllabus Analyzer</w:t>
+        <w:t xml:space="preserve">Built a </w:t>
       </w:r>
       <w:r>
-        <w:tab/>
+        <w:t xml:space="preserve">full-stack web </w:t>
       </w:r>
-    </w:p>
-    <w:p>
-      <w:pPr>
-        <w:pStyle w:val="ListBullet"/>
-      </w:pPr>
       <w:r>
-        <w:t>Built a Python and React app that turns syllabus text into assignment dates, grading rubrics, and reading schedules for a calendar.</w:t>
+        <w:t>app that turns syllabus text into assignment dates, grading rubrics, and reading schedules for a calendar.</w:t>
       </w:r>
     </w:p>
     <w:p>
@@ -547,7 +555,6 @@
         <w:rPr>
           <w:b/>
         </w:rPr>
-        <w:lastRenderedPageBreak/>
         <w:t>SKILLS &amp; INTERESTS</w:t>
       </w:r>
     </w:p>
@@ -556,15 +563,13 @@
         <w:pStyle w:val="ListBullet"/>
       </w:pPr>
       <w:r>
-        <w:t>Technical: Python, Java, JavaScript, React, CSS, HTML, Stata, R, Pandas, regression, machine learning, econometrics, Excel, ArcGIS Pro</w:t>
+        <w:t>Python, Java, JavaScript, React, CSS, HTML, Stata, R, Pandas, regression, machine learning, econometrics, Excel, ArcGIS Pro</w:t>
       </w:r>
-    </w:p>
-    <w:p>
-      <w:pPr>
-        <w:pStyle w:val="ListBullet"/>
-      </w:pPr>
       <w:r>
-        <w:t>Tools: PowerPoint, Photoshop, Final Cut Pro, Framer</w:t>
+        <w:t xml:space="preserve">, Agentic Coding (Claude Code, Codex, Cursor), </w:t>
+      </w:r>
+      <w:r>
+        <w:t xml:space="preserve"> PowerPoint, Photoshop, Final Cut Pro, Framer</w:t>
       </w:r>
     </w:p>
     <w:sectPr>

</xml_diff>

<commit_message>
Update resume contact line
</commit_message>
<xml_diff>
--- a/website/public/resume/Pierce-Seigne-Resume.docx
+++ b/website/public/resume/Pierce-Seigne-Resume.docx
@@ -20,11 +20,11 @@
         <w:jc w:val="center"/>
       </w:pPr>
       <w:r>
-        <w:t xml:space="preserve">Charlottesville, VA </w:t>
+        <w:t>Charlottesville, VA</w:t>
       </w:r>
       <w:proofErr w:type="gramStart"/>
       <w:r>
-        <w:t>22903  •</w:t>
+        <w:t xml:space="preserve">  •</w:t>
       </w:r>
       <w:proofErr w:type="gramEnd"/>
       <w:r>

</xml_diff>